<commit_message>
Update project documentation with the final pipeline and results
</commit_message>
<xml_diff>
--- a/Project_Documentation.docx
+++ b/Project_Documentation.docx
@@ -49,12 +49,21 @@
         </w:rPr>
         <w:t xml:space="preserve">Name: </w:t>
       </w:r>
+      <w:proofErr w:type="spellStart"/>
       <w:r>
         <w:rPr>
           <w:sz w:val="28"/>
           <w:szCs w:val="28"/>
         </w:rPr>
-        <w:t>Uzair Khan</w:t>
+        <w:t>Uzair</w:t>
+      </w:r>
+      <w:proofErr w:type="spellEnd"/>
+      <w:r>
+        <w:rPr>
+          <w:sz w:val="28"/>
+          <w:szCs w:val="28"/>
+        </w:rPr>
+        <w:t xml:space="preserve"> Khan</w:t>
       </w:r>
     </w:p>
     <w:p>
@@ -78,8 +87,6 @@
         </w:rPr>
         <w:t>F2024376506</w:t>
       </w:r>
-      <w:bookmarkStart w:id="0" w:name="_GoBack"/>
-      <w:bookmarkEnd w:id="0"/>
     </w:p>
     <w:p>
       <w:pPr>
@@ -92,16 +99,46 @@
           <w:sz w:val="20"/>
           <w:szCs w:val="20"/>
         </w:rPr>
-        <w:t>P</w:t>
-      </w:r>
+        <w:t xml:space="preserve">Python </w:t>
+      </w:r>
+      <w:proofErr w:type="gramStart"/>
       <w:r>
         <w:rPr>
           <w:color w:val="7F7F7F"/>
           <w:sz w:val="20"/>
           <w:szCs w:val="20"/>
         </w:rPr>
-        <w:t>ython  |  YouTube Data API v3  |  Transformers  |  Pandas  |  Matplotlib</w:t>
-      </w:r>
+        <w:t>|  YouTube</w:t>
+      </w:r>
+      <w:proofErr w:type="gramEnd"/>
+      <w:r>
+        <w:rPr>
+          <w:color w:val="7F7F7F"/>
+          <w:sz w:val="20"/>
+          <w:szCs w:val="20"/>
+        </w:rPr>
+        <w:t xml:space="preserve"> Data API v3 </w:t>
+      </w:r>
+      <w:r>
+        <w:rPr>
+          <w:color w:val="7F7F7F"/>
+          <w:sz w:val="20"/>
+          <w:szCs w:val="20"/>
+        </w:rPr>
+        <w:t xml:space="preserve"> |  Transformers  |  Pandas  | </w:t>
+      </w:r>
+      <w:bookmarkStart w:id="0" w:name="_GoBack"/>
+      <w:bookmarkEnd w:id="0"/>
+      <w:proofErr w:type="spellStart"/>
+      <w:r>
+        <w:rPr>
+          <w:color w:val="7F7F7F"/>
+          <w:sz w:val="20"/>
+          <w:szCs w:val="20"/>
+        </w:rPr>
+        <w:t>Matplotlib</w:t>
+      </w:r>
+      <w:proofErr w:type="spellEnd"/>
     </w:p>
     <w:p>
       <w:r>
@@ -125,10 +162,15 @@
         <w:spacing w:after="120" w:line="300" w:lineRule="auto"/>
       </w:pPr>
       <w:r>
-        <w:t>This project collects public comments from YouTube videos and classifies each comment as Positive, Neutral or Negative. It then produces exploratory data analysis (EDA) tables and charts that summarise how viewers reacted. The comments are written in Engli</w:t>
-      </w:r>
-      <w:r>
-        <w:t>sh, Roman Urdu and Hinglish, with some Urdu and Hindi script, so a normal English-only sentiment tool is not enough.</w:t>
+        <w:t xml:space="preserve">This project collects public comments from YouTube videos and classifies each comment as Positive, Neutral or Negative. It then produces exploratory data analysis (EDA) tables and charts that </w:t>
+      </w:r>
+      <w:proofErr w:type="spellStart"/>
+      <w:r>
+        <w:t>summarise</w:t>
+      </w:r>
+      <w:proofErr w:type="spellEnd"/>
+      <w:r>
+        <w:t xml:space="preserve"> how viewers reacted. The comments are written in English, Roman Urdu and Hinglish, with some Urdu and Hindi script, so a normal English-only sentiment tool is not enough.</w:t>
       </w:r>
     </w:p>
     <w:p>
@@ -165,10 +207,15 @@
         <w:spacing w:after="70"/>
       </w:pPr>
       <w:r>
-        <w:t xml:space="preserve">Keep data collection and sentiment analysis </w:t>
-      </w:r>
-      <w:r>
-        <w:t>as two separate steps, so comments can be gathered once and analysed later.</w:t>
+        <w:t xml:space="preserve">Keep data collection and sentiment analysis as two separate steps, so comments can be gathered once and </w:t>
+      </w:r>
+      <w:proofErr w:type="spellStart"/>
+      <w:r>
+        <w:t>analysed</w:t>
+      </w:r>
+      <w:proofErr w:type="spellEnd"/>
+      <w:r>
+        <w:t xml:space="preserve"> later.</w:t>
       </w:r>
     </w:p>
     <w:p>
@@ -207,10 +254,7 @@
         <w:spacing w:after="70"/>
       </w:pPr>
       <w:r>
-        <w:t>Produce clear EDA outputs: distribution, score histogram, length analysi</w:t>
-      </w:r>
-      <w:r>
-        <w:t>s, time trend and distinctive words.</w:t>
+        <w:t>Produce clear EDA outputs: distribution, score histogram, length analysis, time trend and distinctive words.</w:t>
       </w:r>
     </w:p>
     <w:p>
@@ -259,12 +303,6 @@
         <w:gridCol w:w="6760"/>
       </w:tblGrid>
       <w:tr>
-        <w:tblPrEx>
-          <w:tblCellMar>
-            <w:top w:w="0" w:type="dxa"/>
-            <w:bottom w:w="0" w:type="dxa"/>
-          </w:tblCellMar>
-        </w:tblPrEx>
         <w:trPr>
           <w:tblHeader/>
         </w:trPr>
@@ -330,12 +368,6 @@
         </w:tc>
       </w:tr>
       <w:tr>
-        <w:tblPrEx>
-          <w:tblCellMar>
-            <w:top w:w="0" w:type="dxa"/>
-            <w:bottom w:w="0" w:type="dxa"/>
-          </w:tblCellMar>
-        </w:tblPrEx>
         <w:tc>
           <w:tcPr>
             <w:tcW w:w="2600" w:type="dxa"/>
@@ -392,12 +424,6 @@
         </w:tc>
       </w:tr>
       <w:tr>
-        <w:tblPrEx>
-          <w:tblCellMar>
-            <w:top w:w="0" w:type="dxa"/>
-            <w:bottom w:w="0" w:type="dxa"/>
-          </w:tblCellMar>
-        </w:tblPrEx>
         <w:tc>
           <w:tcPr>
             <w:tcW w:w="2600" w:type="dxa"/>
@@ -422,7 +448,25 @@
                 <w:sz w:val="20"/>
                 <w:szCs w:val="20"/>
               </w:rPr>
-              <w:t>YouTube Data API v3 (google-api-python-client)</w:t>
+              <w:t>YouTube Data API v3 (google-</w:t>
+            </w:r>
+            <w:proofErr w:type="spellStart"/>
+            <w:r>
+              <w:rPr>
+                <w:color w:val="000000"/>
+                <w:sz w:val="20"/>
+                <w:szCs w:val="20"/>
+              </w:rPr>
+              <w:t>api</w:t>
+            </w:r>
+            <w:proofErr w:type="spellEnd"/>
+            <w:r>
+              <w:rPr>
+                <w:color w:val="000000"/>
+                <w:sz w:val="20"/>
+                <w:szCs w:val="20"/>
+              </w:rPr>
+              <w:t>-python-client)</w:t>
             </w:r>
           </w:p>
         </w:tc>
@@ -456,12 +500,6 @@
         </w:tc>
       </w:tr>
       <w:tr>
-        <w:tblPrEx>
-          <w:tblCellMar>
-            <w:top w:w="0" w:type="dxa"/>
-            <w:bottom w:w="0" w:type="dxa"/>
-          </w:tblCellMar>
-        </w:tblPrEx>
         <w:tc>
           <w:tcPr>
             <w:tcW w:w="2600" w:type="dxa"/>
@@ -485,8 +523,18 @@
                 <w:sz w:val="20"/>
                 <w:szCs w:val="20"/>
               </w:rPr>
-              <w:t>pandas, numpy</w:t>
-            </w:r>
+              <w:t xml:space="preserve">pandas, </w:t>
+            </w:r>
+            <w:proofErr w:type="spellStart"/>
+            <w:r>
+              <w:rPr>
+                <w:color w:val="000000"/>
+                <w:sz w:val="20"/>
+                <w:szCs w:val="20"/>
+              </w:rPr>
+              <w:t>numpy</w:t>
+            </w:r>
+            <w:proofErr w:type="spellEnd"/>
           </w:p>
         </w:tc>
         <w:tc>
@@ -518,12 +566,6 @@
         </w:tc>
       </w:tr>
       <w:tr>
-        <w:tblPrEx>
-          <w:tblCellMar>
-            <w:top w:w="0" w:type="dxa"/>
-            <w:bottom w:w="0" w:type="dxa"/>
-          </w:tblCellMar>
-        </w:tblPrEx>
         <w:tc>
           <w:tcPr>
             <w:tcW w:w="2600" w:type="dxa"/>
@@ -542,6 +584,7 @@
             </w:tcMar>
           </w:tcPr>
           <w:p>
+            <w:proofErr w:type="spellStart"/>
             <w:r>
               <w:rPr>
                 <w:color w:val="000000"/>
@@ -550,6 +593,7 @@
               </w:rPr>
               <w:t>matplotlib</w:t>
             </w:r>
+            <w:proofErr w:type="spellEnd"/>
           </w:p>
         </w:tc>
         <w:tc>
@@ -582,12 +626,6 @@
         </w:tc>
       </w:tr>
       <w:tr>
-        <w:tblPrEx>
-          <w:tblCellMar>
-            <w:top w:w="0" w:type="dxa"/>
-            <w:bottom w:w="0" w:type="dxa"/>
-          </w:tblCellMar>
-        </w:tblPrEx>
         <w:tc>
           <w:tcPr>
             <w:tcW w:w="2600" w:type="dxa"/>
@@ -611,8 +649,18 @@
                 <w:sz w:val="20"/>
                 <w:szCs w:val="20"/>
               </w:rPr>
-              <w:t>transformers, torch, sentencepiece</w:t>
-            </w:r>
+              <w:t xml:space="preserve">transformers, torch, </w:t>
+            </w:r>
+            <w:proofErr w:type="spellStart"/>
+            <w:r>
+              <w:rPr>
+                <w:color w:val="000000"/>
+                <w:sz w:val="20"/>
+                <w:szCs w:val="20"/>
+              </w:rPr>
+              <w:t>sentencepiece</w:t>
+            </w:r>
+            <w:proofErr w:type="spellEnd"/>
           </w:p>
         </w:tc>
         <w:tc>
@@ -638,18 +686,84 @@
                 <w:sz w:val="20"/>
                 <w:szCs w:val="20"/>
               </w:rPr>
-              <w:t>Multilingual XLM-RoBERTa sentiment model (cardiffnlp/twitter-xlm-roberta-base-sentiment)</w:t>
+              <w:t>Multilingual XLM-</w:t>
+            </w:r>
+            <w:proofErr w:type="spellStart"/>
+            <w:r>
+              <w:rPr>
+                <w:color w:val="000000"/>
+                <w:sz w:val="20"/>
+                <w:szCs w:val="20"/>
+              </w:rPr>
+              <w:t>RoBERTa</w:t>
+            </w:r>
+            <w:proofErr w:type="spellEnd"/>
+            <w:r>
+              <w:rPr>
+                <w:color w:val="000000"/>
+                <w:sz w:val="20"/>
+                <w:szCs w:val="20"/>
+              </w:rPr>
+              <w:t xml:space="preserve"> sentiment model (</w:t>
+            </w:r>
+            <w:proofErr w:type="spellStart"/>
+            <w:r>
+              <w:rPr>
+                <w:color w:val="000000"/>
+                <w:sz w:val="20"/>
+                <w:szCs w:val="20"/>
+              </w:rPr>
+              <w:t>cardiffnlp</w:t>
+            </w:r>
+            <w:proofErr w:type="spellEnd"/>
+            <w:r>
+              <w:rPr>
+                <w:color w:val="000000"/>
+                <w:sz w:val="20"/>
+                <w:szCs w:val="20"/>
+              </w:rPr>
+              <w:t>/twitter-</w:t>
+            </w:r>
+            <w:proofErr w:type="spellStart"/>
+            <w:r>
+              <w:rPr>
+                <w:color w:val="000000"/>
+                <w:sz w:val="20"/>
+                <w:szCs w:val="20"/>
+              </w:rPr>
+              <w:t>xlm</w:t>
+            </w:r>
+            <w:proofErr w:type="spellEnd"/>
+            <w:r>
+              <w:rPr>
+                <w:color w:val="000000"/>
+                <w:sz w:val="20"/>
+                <w:szCs w:val="20"/>
+              </w:rPr>
+              <w:t>-</w:t>
+            </w:r>
+            <w:proofErr w:type="spellStart"/>
+            <w:r>
+              <w:rPr>
+                <w:color w:val="000000"/>
+                <w:sz w:val="20"/>
+                <w:szCs w:val="20"/>
+              </w:rPr>
+              <w:t>roberta</w:t>
+            </w:r>
+            <w:proofErr w:type="spellEnd"/>
+            <w:r>
+              <w:rPr>
+                <w:color w:val="000000"/>
+                <w:sz w:val="20"/>
+                <w:szCs w:val="20"/>
+              </w:rPr>
+              <w:t>-base-sentiment)</w:t>
             </w:r>
           </w:p>
         </w:tc>
       </w:tr>
       <w:tr>
-        <w:tblPrEx>
-          <w:tblCellMar>
-            <w:top w:w="0" w:type="dxa"/>
-            <w:bottom w:w="0" w:type="dxa"/>
-          </w:tblCellMar>
-        </w:tblPrEx>
         <w:tc>
           <w:tcPr>
             <w:tcW w:w="2600" w:type="dxa"/>
@@ -668,6 +782,7 @@
             </w:tcMar>
           </w:tcPr>
           <w:p>
+            <w:proofErr w:type="spellStart"/>
             <w:r>
               <w:rPr>
                 <w:color w:val="000000"/>
@@ -676,6 +791,7 @@
               </w:rPr>
               <w:t>vaderSentiment</w:t>
             </w:r>
+            <w:proofErr w:type="spellEnd"/>
           </w:p>
         </w:tc>
         <w:tc>
@@ -708,12 +824,6 @@
         </w:tc>
       </w:tr>
       <w:tr>
-        <w:tblPrEx>
-          <w:tblCellMar>
-            <w:top w:w="0" w:type="dxa"/>
-            <w:bottom w:w="0" w:type="dxa"/>
-          </w:tblCellMar>
-        </w:tblPrEx>
         <w:tc>
           <w:tcPr>
             <w:tcW w:w="2600" w:type="dxa"/>
@@ -770,12 +880,6 @@
         </w:tc>
       </w:tr>
       <w:tr>
-        <w:tblPrEx>
-          <w:tblCellMar>
-            <w:top w:w="0" w:type="dxa"/>
-            <w:bottom w:w="0" w:type="dxa"/>
-          </w:tblCellMar>
-        </w:tblPrEx>
         <w:tc>
           <w:tcPr>
             <w:tcW w:w="2600" w:type="dxa"/>
@@ -800,8 +904,18 @@
                 <w:sz w:val="20"/>
                 <w:szCs w:val="20"/>
               </w:rPr>
-              <w:t>python-dotenv</w:t>
-            </w:r>
+              <w:t>python-</w:t>
+            </w:r>
+            <w:proofErr w:type="spellStart"/>
+            <w:r>
+              <w:rPr>
+                <w:color w:val="000000"/>
+                <w:sz w:val="20"/>
+                <w:szCs w:val="20"/>
+              </w:rPr>
+              <w:t>dotenv</w:t>
+            </w:r>
+            <w:proofErr w:type="spellEnd"/>
           </w:p>
         </w:tc>
         <w:tc>
@@ -828,18 +942,30 @@
                 <w:sz w:val="20"/>
                 <w:szCs w:val="20"/>
               </w:rPr>
-              <w:t>Reads the API keys from a .env file</w:t>
+              <w:t>Reads the API keys from a .</w:t>
+            </w:r>
+            <w:proofErr w:type="spellStart"/>
+            <w:r>
+              <w:rPr>
+                <w:color w:val="000000"/>
+                <w:sz w:val="20"/>
+                <w:szCs w:val="20"/>
+              </w:rPr>
+              <w:t>env</w:t>
+            </w:r>
+            <w:proofErr w:type="spellEnd"/>
+            <w:r>
+              <w:rPr>
+                <w:color w:val="000000"/>
+                <w:sz w:val="20"/>
+                <w:szCs w:val="20"/>
+              </w:rPr>
+              <w:t xml:space="preserve"> file</w:t>
             </w:r>
           </w:p>
         </w:tc>
       </w:tr>
       <w:tr>
-        <w:tblPrEx>
-          <w:tblCellMar>
-            <w:top w:w="0" w:type="dxa"/>
-            <w:bottom w:w="0" w:type="dxa"/>
-          </w:tblCellMar>
-        </w:tblPrEx>
         <w:tc>
           <w:tcPr>
             <w:tcW w:w="2600" w:type="dxa"/>
@@ -857,6 +983,7 @@
             </w:tcMar>
           </w:tcPr>
           <w:p>
+            <w:proofErr w:type="spellStart"/>
             <w:r>
               <w:rPr>
                 <w:color w:val="000000"/>
@@ -865,6 +992,7 @@
               </w:rPr>
               <w:t>pytest</w:t>
             </w:r>
+            <w:proofErr w:type="spellEnd"/>
           </w:p>
         </w:tc>
         <w:tc>
@@ -934,12 +1062,6 @@
         <w:gridCol w:w="6908"/>
       </w:tblGrid>
       <w:tr>
-        <w:tblPrEx>
-          <w:tblCellMar>
-            <w:top w:w="0" w:type="dxa"/>
-            <w:bottom w:w="0" w:type="dxa"/>
-          </w:tblCellMar>
-        </w:tblPrEx>
         <w:trPr>
           <w:tblHeader/>
         </w:trPr>
@@ -1006,12 +1128,6 @@
         </w:tc>
       </w:tr>
       <w:tr>
-        <w:tblPrEx>
-          <w:tblCellMar>
-            <w:top w:w="0" w:type="dxa"/>
-            <w:bottom w:w="0" w:type="dxa"/>
-          </w:tblCellMar>
-        </w:tblPrEx>
         <w:tc>
           <w:tcPr>
             <w:tcW w:w="2400" w:type="dxa"/>
@@ -1068,12 +1184,6 @@
         </w:tc>
       </w:tr>
       <w:tr>
-        <w:tblPrEx>
-          <w:tblCellMar>
-            <w:top w:w="0" w:type="dxa"/>
-            <w:bottom w:w="0" w:type="dxa"/>
-          </w:tblCellMar>
-        </w:tblPrEx>
         <w:tc>
           <w:tcPr>
             <w:tcW w:w="2400" w:type="dxa"/>
@@ -1132,12 +1242,6 @@
         </w:tc>
       </w:tr>
       <w:tr>
-        <w:tblPrEx>
-          <w:tblCellMar>
-            <w:top w:w="0" w:type="dxa"/>
-            <w:bottom w:w="0" w:type="dxa"/>
-          </w:tblCellMar>
-        </w:tblPrEx>
         <w:tc>
           <w:tcPr>
             <w:tcW w:w="2400" w:type="dxa"/>
@@ -1188,26 +1292,30 @@
                 <w:sz w:val="20"/>
                 <w:szCs w:val="20"/>
               </w:rPr>
-              <w:t>Sentiment engines (XLM-RoBERTa, VADER, Claude), the Roman Urdu/Hinglish/emoji lexicon, the stance rules</w:t>
-            </w:r>
-            <w:r>
-              <w:rPr>
-                <w:color w:val="000000"/>
-                <w:sz w:val="20"/>
-                <w:szCs w:val="20"/>
-              </w:rPr>
-              <w:t xml:space="preserve"> and the thresholds.</w:t>
+              <w:t>Sentiment engines (XLM-</w:t>
+            </w:r>
+            <w:proofErr w:type="spellStart"/>
+            <w:r>
+              <w:rPr>
+                <w:color w:val="000000"/>
+                <w:sz w:val="20"/>
+                <w:szCs w:val="20"/>
+              </w:rPr>
+              <w:t>RoBERTa</w:t>
+            </w:r>
+            <w:proofErr w:type="spellEnd"/>
+            <w:r>
+              <w:rPr>
+                <w:color w:val="000000"/>
+                <w:sz w:val="20"/>
+                <w:szCs w:val="20"/>
+              </w:rPr>
+              <w:t>, VADER, Claude), the Roman Urdu/Hinglish/emoji lexicon, the stance rules and the thresholds.</w:t>
             </w:r>
           </w:p>
         </w:tc>
       </w:tr>
       <w:tr>
-        <w:tblPrEx>
-          <w:tblCellMar>
-            <w:top w:w="0" w:type="dxa"/>
-            <w:bottom w:w="0" w:type="dxa"/>
-          </w:tblCellMar>
-        </w:tblPrEx>
         <w:tc>
           <w:tcPr>
             <w:tcW w:w="2400" w:type="dxa"/>
@@ -1266,12 +1374,6 @@
         </w:tc>
       </w:tr>
       <w:tr>
-        <w:tblPrEx>
-          <w:tblCellMar>
-            <w:top w:w="0" w:type="dxa"/>
-            <w:bottom w:w="0" w:type="dxa"/>
-          </w:tblCellMar>
-        </w:tblPrEx>
         <w:tc>
           <w:tcPr>
             <w:tcW w:w="2400" w:type="dxa"/>
@@ -1328,12 +1430,6 @@
         </w:tc>
       </w:tr>
       <w:tr>
-        <w:tblPrEx>
-          <w:tblCellMar>
-            <w:top w:w="0" w:type="dxa"/>
-            <w:bottom w:w="0" w:type="dxa"/>
-          </w:tblCellMar>
-        </w:tblPrEx>
         <w:tc>
           <w:tcPr>
             <w:tcW w:w="2400" w:type="dxa"/>
@@ -1392,12 +1488,6 @@
         </w:tc>
       </w:tr>
       <w:tr>
-        <w:tblPrEx>
-          <w:tblCellMar>
-            <w:top w:w="0" w:type="dxa"/>
-            <w:bottom w:w="0" w:type="dxa"/>
-          </w:tblCellMar>
-        </w:tblPrEx>
         <w:tc>
           <w:tcPr>
             <w:tcW w:w="2400" w:type="dxa"/>
@@ -1454,12 +1544,6 @@
         </w:tc>
       </w:tr>
       <w:tr>
-        <w:tblPrEx>
-          <w:tblCellMar>
-            <w:top w:w="0" w:type="dxa"/>
-            <w:bottom w:w="0" w:type="dxa"/>
-          </w:tblCellMar>
-        </w:tblPrEx>
         <w:tc>
           <w:tcPr>
             <w:tcW w:w="2400" w:type="dxa"/>
@@ -1576,10 +1660,7 @@
         <w:spacing w:after="70"/>
       </w:pPr>
       <w:r>
-        <w:t xml:space="preserve">Request top-level comments through the YouTube Data API in pages of 100, using both the relevance and the time order to get more </w:t>
-      </w:r>
-      <w:r>
-        <w:t>variety.</w:t>
+        <w:t>Request top-level comments through the YouTube Data API in pages of 100, using both the relevance and the time order to get more variety.</w:t>
       </w:r>
     </w:p>
     <w:p>
@@ -1629,10 +1710,7 @@
         <w:spacing w:after="70"/>
       </w:pPr>
       <w:r>
-        <w:t>Load raw_comments.cs</w:t>
-      </w:r>
-      <w:r>
-        <w:t>v.</w:t>
+        <w:t>Load raw_comments.csv.</w:t>
       </w:r>
     </w:p>
     <w:p>
@@ -1684,10 +1762,7 @@
         <w:spacing w:after="70"/>
       </w:pPr>
       <w:r>
-        <w:t>Sc</w:t>
-      </w:r>
-      <w:r>
-        <w:t>ore and label each comment with the chosen engine.</w:t>
+        <w:t>Score and label each comment with the chosen engine.</w:t>
       </w:r>
     </w:p>
     <w:p>
@@ -1700,7 +1775,15 @@
         <w:spacing w:after="70"/>
       </w:pPr>
       <w:r>
-        <w:t>Save classified_comments.csv, review_sample.csv, eda_summary.txt, eda tables and five charts.</w:t>
+        <w:t xml:space="preserve">Save classified_comments.csv, review_sample.csv, eda_summary.txt, </w:t>
+      </w:r>
+      <w:proofErr w:type="spellStart"/>
+      <w:r>
+        <w:t>eda</w:t>
+      </w:r>
+      <w:proofErr w:type="spellEnd"/>
+      <w:r>
+        <w:t xml:space="preserve"> tables and five charts.</w:t>
       </w:r>
     </w:p>
     <w:p>
@@ -1720,10 +1803,7 @@
       </w:pPr>
       <w:r>
         <w:lastRenderedPageBreak/>
-        <w:t>The dataset used for the results in this report was collected from one controversial brand a</w:t>
-      </w:r>
-      <w:r>
-        <w:t>dvertisement video on YouTube (video ID UYaY2Kb_PKI).</w:t>
+        <w:t>The dataset used for the results in this report was collected from one controversial brand advertisement video on YouTube (video ID UYaY2Kb_PKI).</w:t>
       </w:r>
     </w:p>
     <w:tbl>
@@ -1748,12 +1828,6 @@
         <w:gridCol w:w="5160"/>
       </w:tblGrid>
       <w:tr>
-        <w:tblPrEx>
-          <w:tblCellMar>
-            <w:top w:w="0" w:type="dxa"/>
-            <w:bottom w:w="0" w:type="dxa"/>
-          </w:tblCellMar>
-        </w:tblPrEx>
         <w:trPr>
           <w:tblHeader/>
         </w:trPr>
@@ -1819,12 +1893,6 @@
         </w:tc>
       </w:tr>
       <w:tr>
-        <w:tblPrEx>
-          <w:tblCellMar>
-            <w:top w:w="0" w:type="dxa"/>
-            <w:bottom w:w="0" w:type="dxa"/>
-          </w:tblCellMar>
-        </w:tblPrEx>
         <w:tc>
           <w:tcPr>
             <w:tcW w:w="4200" w:type="dxa"/>
@@ -1881,12 +1949,6 @@
         </w:tc>
       </w:tr>
       <w:tr>
-        <w:tblPrEx>
-          <w:tblCellMar>
-            <w:top w:w="0" w:type="dxa"/>
-            <w:bottom w:w="0" w:type="dxa"/>
-          </w:tblCellMar>
-        </w:tblPrEx>
         <w:tc>
           <w:tcPr>
             <w:tcW w:w="4200" w:type="dxa"/>
@@ -1945,12 +2007,6 @@
         </w:tc>
       </w:tr>
       <w:tr>
-        <w:tblPrEx>
-          <w:tblCellMar>
-            <w:top w:w="0" w:type="dxa"/>
-            <w:bottom w:w="0" w:type="dxa"/>
-          </w:tblCellMar>
-        </w:tblPrEx>
         <w:tc>
           <w:tcPr>
             <w:tcW w:w="4200" w:type="dxa"/>
@@ -2007,12 +2063,6 @@
         </w:tc>
       </w:tr>
       <w:tr>
-        <w:tblPrEx>
-          <w:tblCellMar>
-            <w:top w:w="0" w:type="dxa"/>
-            <w:bottom w:w="0" w:type="dxa"/>
-          </w:tblCellMar>
-        </w:tblPrEx>
         <w:tc>
           <w:tcPr>
             <w:tcW w:w="4200" w:type="dxa"/>
@@ -2071,12 +2121,6 @@
         </w:tc>
       </w:tr>
       <w:tr>
-        <w:tblPrEx>
-          <w:tblCellMar>
-            <w:top w:w="0" w:type="dxa"/>
-            <w:bottom w:w="0" w:type="dxa"/>
-          </w:tblCellMar>
-        </w:tblPrEx>
         <w:tc>
           <w:tcPr>
             <w:tcW w:w="4200" w:type="dxa"/>
@@ -2133,12 +2177,6 @@
         </w:tc>
       </w:tr>
       <w:tr>
-        <w:tblPrEx>
-          <w:tblCellMar>
-            <w:top w:w="0" w:type="dxa"/>
-            <w:bottom w:w="0" w:type="dxa"/>
-          </w:tblCellMar>
-        </w:tblPrEx>
         <w:tc>
           <w:tcPr>
             <w:tcW w:w="4200" w:type="dxa"/>
@@ -2229,10 +2267,7 @@
         <w:spacing w:after="120" w:line="300" w:lineRule="auto"/>
       </w:pPr>
       <w:r>
-        <w:t>The first version used VADER, which only understands English. On Roman Urdu comments it returned a score of about zero, so a large share of comments became falsely Neutral, and words such as "crying" were read as negative even when viewers meant it as prai</w:t>
-      </w:r>
-      <w:r>
-        <w:t>se. The brand names also appeared as top positive words. This showed that the first version was not reliable.</w:t>
+        <w:t>The first version used VADER, which only understands English. On Roman Urdu comments it returned a score of about zero, so a large share of comments became falsely Neutral, and words such as "crying" were read as negative even when viewers meant it as praise. The brand names also appeared as top positive words. This showed that the first version was not reliable.</w:t>
       </w:r>
     </w:p>
     <w:p>
@@ -2268,12 +2303,6 @@
         <w:gridCol w:w="7660"/>
       </w:tblGrid>
       <w:tr>
-        <w:tblPrEx>
-          <w:tblCellMar>
-            <w:top w:w="0" w:type="dxa"/>
-            <w:bottom w:w="0" w:type="dxa"/>
-          </w:tblCellMar>
-        </w:tblPrEx>
         <w:trPr>
           <w:tblHeader/>
         </w:trPr>
@@ -2339,12 +2368,6 @@
         </w:tc>
       </w:tr>
       <w:tr>
-        <w:tblPrEx>
-          <w:tblCellMar>
-            <w:top w:w="0" w:type="dxa"/>
-            <w:bottom w:w="0" w:type="dxa"/>
-          </w:tblCellMar>
-        </w:tblPrEx>
         <w:tc>
           <w:tcPr>
             <w:tcW w:w="1700" w:type="dxa"/>
@@ -2362,13 +2385,23 @@
             </w:tcMar>
           </w:tcPr>
           <w:p>
-            <w:r>
-              <w:rPr>
-                <w:color w:val="000000"/>
-                <w:sz w:val="20"/>
-                <w:szCs w:val="20"/>
-              </w:rPr>
-              <w:t>xlmr (default)</w:t>
+            <w:proofErr w:type="spellStart"/>
+            <w:r>
+              <w:rPr>
+                <w:color w:val="000000"/>
+                <w:sz w:val="20"/>
+                <w:szCs w:val="20"/>
+              </w:rPr>
+              <w:t>xlmr</w:t>
+            </w:r>
+            <w:proofErr w:type="spellEnd"/>
+            <w:r>
+              <w:rPr>
+                <w:color w:val="000000"/>
+                <w:sz w:val="20"/>
+                <w:szCs w:val="20"/>
+              </w:rPr>
+              <w:t xml:space="preserve"> (default)</w:t>
             </w:r>
           </w:p>
         </w:tc>
@@ -2395,26 +2428,48 @@
                 <w:sz w:val="20"/>
                 <w:szCs w:val="20"/>
               </w:rPr>
-              <w:t xml:space="preserve">Multilingual XLM-RoBERTa model. The score is P(positive) minus P(negative), in the range -1 to 1. </w:t>
-            </w:r>
-            <w:r>
-              <w:rPr>
-                <w:color w:val="000000"/>
-                <w:sz w:val="20"/>
-                <w:szCs w:val="20"/>
-              </w:rPr>
-              <w:t>The confidence is the highest class probability.</w:t>
+              <w:t>Multilingual XLM-</w:t>
+            </w:r>
+            <w:proofErr w:type="spellStart"/>
+            <w:r>
+              <w:rPr>
+                <w:color w:val="000000"/>
+                <w:sz w:val="20"/>
+                <w:szCs w:val="20"/>
+              </w:rPr>
+              <w:t>RoBERTa</w:t>
+            </w:r>
+            <w:proofErr w:type="spellEnd"/>
+            <w:r>
+              <w:rPr>
+                <w:color w:val="000000"/>
+                <w:sz w:val="20"/>
+                <w:szCs w:val="20"/>
+              </w:rPr>
+              <w:t xml:space="preserve"> model. The score is </w:t>
+            </w:r>
+            <w:proofErr w:type="gramStart"/>
+            <w:r>
+              <w:rPr>
+                <w:color w:val="000000"/>
+                <w:sz w:val="20"/>
+                <w:szCs w:val="20"/>
+              </w:rPr>
+              <w:t>P(</w:t>
+            </w:r>
+            <w:proofErr w:type="gramEnd"/>
+            <w:r>
+              <w:rPr>
+                <w:color w:val="000000"/>
+                <w:sz w:val="20"/>
+                <w:szCs w:val="20"/>
+              </w:rPr>
+              <w:t>positive) minus P(negative), in the range -1 to 1. The confidence is the highest class probability.</w:t>
             </w:r>
           </w:p>
         </w:tc>
       </w:tr>
       <w:tr>
-        <w:tblPrEx>
-          <w:tblCellMar>
-            <w:top w:w="0" w:type="dxa"/>
-            <w:bottom w:w="0" w:type="dxa"/>
-          </w:tblCellMar>
-        </w:tblPrEx>
         <w:tc>
           <w:tcPr>
             <w:tcW w:w="1700" w:type="dxa"/>
@@ -2433,6 +2488,7 @@
             </w:tcMar>
           </w:tcPr>
           <w:p>
+            <w:proofErr w:type="spellStart"/>
             <w:r>
               <w:rPr>
                 <w:color w:val="000000"/>
@@ -2441,6 +2497,7 @@
               </w:rPr>
               <w:t>vader</w:t>
             </w:r>
+            <w:proofErr w:type="spellEnd"/>
           </w:p>
         </w:tc>
         <w:tc>
@@ -2473,12 +2530,6 @@
         </w:tc>
       </w:tr>
       <w:tr>
-        <w:tblPrEx>
-          <w:tblCellMar>
-            <w:top w:w="0" w:type="dxa"/>
-            <w:bottom w:w="0" w:type="dxa"/>
-          </w:tblCellMar>
-        </w:tblPrEx>
         <w:tc>
           <w:tcPr>
             <w:tcW w:w="1700" w:type="dxa"/>
@@ -2496,13 +2547,23 @@
             </w:tcMar>
           </w:tcPr>
           <w:p>
-            <w:r>
-              <w:rPr>
-                <w:color w:val="000000"/>
-                <w:sz w:val="20"/>
-                <w:szCs w:val="20"/>
-              </w:rPr>
-              <w:t>claude (optional)</w:t>
+            <w:proofErr w:type="spellStart"/>
+            <w:r>
+              <w:rPr>
+                <w:color w:val="000000"/>
+                <w:sz w:val="20"/>
+                <w:szCs w:val="20"/>
+              </w:rPr>
+              <w:t>claude</w:t>
+            </w:r>
+            <w:proofErr w:type="spellEnd"/>
+            <w:r>
+              <w:rPr>
+                <w:color w:val="000000"/>
+                <w:sz w:val="20"/>
+                <w:szCs w:val="20"/>
+              </w:rPr>
+              <w:t xml:space="preserve"> (optional)</w:t>
             </w:r>
           </w:p>
         </w:tc>
@@ -2548,13 +2609,90 @@
         <w:rPr>
           <w:color w:val="2E74B5"/>
         </w:rPr>
-        <w:t>6.3 Roman Urdu, Hinglish and emoji lex</w:t>
-      </w:r>
+        <w:t>6.3 Roman Urdu, Hinglish and emoji lexicon</w:t>
+      </w:r>
+    </w:p>
+    <w:p>
+      <w:pPr>
+        <w:spacing w:after="120" w:line="300" w:lineRule="auto"/>
+      </w:pPr>
+      <w:r>
+        <w:t xml:space="preserve">A small lexicon adds a signal on top of the model. It contains words such as mashallah, </w:t>
+      </w:r>
+      <w:proofErr w:type="spellStart"/>
+      <w:r>
+        <w:t>zabardast</w:t>
+      </w:r>
+      <w:proofErr w:type="spellEnd"/>
+      <w:r>
+        <w:t xml:space="preserve">, </w:t>
+      </w:r>
+      <w:proofErr w:type="spellStart"/>
+      <w:r>
+        <w:t>acha</w:t>
+      </w:r>
+      <w:proofErr w:type="spellEnd"/>
+      <w:r>
+        <w:t xml:space="preserve">, </w:t>
+      </w:r>
+      <w:proofErr w:type="spellStart"/>
+      <w:r>
+        <w:t>bakwas</w:t>
+      </w:r>
+      <w:proofErr w:type="spellEnd"/>
+      <w:r>
+        <w:t xml:space="preserve">, </w:t>
+      </w:r>
+      <w:proofErr w:type="spellStart"/>
+      <w:r>
+        <w:t>ghatiya</w:t>
+      </w:r>
+      <w:proofErr w:type="spellEnd"/>
+      <w:r>
+        <w:t xml:space="preserve"> and </w:t>
+      </w:r>
+      <w:proofErr w:type="spellStart"/>
+      <w:r>
+        <w:t>bekar</w:t>
+      </w:r>
+      <w:proofErr w:type="spellEnd"/>
+      <w:r>
+        <w:t>, handles stretched spelling (for example "</w:t>
+      </w:r>
+      <w:proofErr w:type="spellStart"/>
+      <w:r>
+        <w:t>loooove</w:t>
+      </w:r>
+      <w:proofErr w:type="spellEnd"/>
+      <w:r>
+        <w:t>"), and handles negation such as "</w:t>
+      </w:r>
+      <w:proofErr w:type="spellStart"/>
+      <w:r>
+        <w:t>acha</w:t>
+      </w:r>
+      <w:proofErr w:type="spellEnd"/>
+      <w:r>
+        <w:t xml:space="preserve"> </w:t>
+      </w:r>
+      <w:proofErr w:type="spellStart"/>
+      <w:r>
+        <w:t>nahi</w:t>
+      </w:r>
+      <w:proofErr w:type="spellEnd"/>
+      <w:r>
+        <w:t>". Emoji also count: positive emoji add to the score and negative emoji subtract. The lexicon contributes 35% of its value to the final score.</w:t>
+      </w:r>
+    </w:p>
+    <w:p>
+      <w:pPr>
+        <w:pStyle w:val="Heading2"/>
+      </w:pPr>
       <w:r>
         <w:rPr>
           <w:color w:val="2E74B5"/>
         </w:rPr>
-        <w:t>icon</w:t>
+        <w:t>6.4 Stance rules for advertisement threads</w:t>
       </w:r>
     </w:p>
     <w:p>
@@ -2562,33 +2700,8 @@
         <w:spacing w:after="120" w:line="300" w:lineRule="auto"/>
       </w:pPr>
       <w:r>
-        <w:t>A small lexicon adds a signal on top of the model. It contains words such as mashallah, zabardast, acha, bakwas, ghatiya and bekar, handles stretched spelling (for example "loooove"), and handles negation such as "acha nahi". Emoji also count: positiv</w:t>
-      </w:r>
-      <w:r>
-        <w:t>e emoji add to the score and negative emoji subtract. The lexicon contributes 35% of its value to the final score.</w:t>
-      </w:r>
-    </w:p>
-    <w:p>
-      <w:pPr>
-        <w:pStyle w:val="Heading2"/>
-      </w:pPr>
-      <w:r>
-        <w:rPr>
-          <w:color w:val="2E74B5"/>
-        </w:rPr>
-        <w:t>6.4 Stance rules for advertisement threads</w:t>
-      </w:r>
-    </w:p>
-    <w:p>
-      <w:pPr>
-        <w:spacing w:after="120" w:line="300" w:lineRule="auto"/>
-      </w:pPr>
-      <w:r>
         <w:lastRenderedPageBreak/>
-        <w:t>In a brand-advertisement thread, a comment's sentiment is really its stance toward the advertiseme</w:t>
-      </w:r>
-      <w:r>
-        <w:t>nt or brand. A general model often misses this. The rules therefore detect:</w:t>
+        <w:t>In a brand-advertisement thread, a comment's sentiment is really its stance toward the advertisement or brand. A general model often misses this. The rules therefore detect:</w:t>
       </w:r>
     </w:p>
     <w:p>
@@ -2627,10 +2740,7 @@
         <w:spacing w:after="70"/>
       </w:pPr>
       <w:r>
-        <w:t>Sarcasm about money lost, for exa</w:t>
-      </w:r>
-      <w:r>
-        <w:t>mple "great job" followed by billions lost.</w:t>
+        <w:t>Sarcasm about money lost, for example "great job" followed by billions lost.</w:t>
       </w:r>
     </w:p>
     <w:p>
@@ -2669,10 +2779,7 @@
         <w:spacing w:after="70"/>
       </w:pPr>
       <w:r>
-        <w:t>Positive statements that are paired wi</w:t>
-      </w:r>
-      <w:r>
-        <w:t>th laughter markers, which are treated as likely sarcasm and set to Neutral.</w:t>
+        <w:t>Positive statements that are paired with laughter markers, which are treated as likely sarcasm and set to Neutral.</w:t>
       </w:r>
     </w:p>
     <w:p>
@@ -2716,12 +2823,6 @@
         <w:gridCol w:w="6960"/>
       </w:tblGrid>
       <w:tr>
-        <w:tblPrEx>
-          <w:tblCellMar>
-            <w:top w:w="0" w:type="dxa"/>
-            <w:bottom w:w="0" w:type="dxa"/>
-          </w:tblCellMar>
-        </w:tblPrEx>
         <w:trPr>
           <w:tblHeader/>
         </w:trPr>
@@ -2787,12 +2888,6 @@
         </w:tc>
       </w:tr>
       <w:tr>
-        <w:tblPrEx>
-          <w:tblCellMar>
-            <w:top w:w="0" w:type="dxa"/>
-            <w:bottom w:w="0" w:type="dxa"/>
-          </w:tblCellMar>
-        </w:tblPrEx>
         <w:tc>
           <w:tcPr>
             <w:tcW w:w="2400" w:type="dxa"/>
@@ -2849,12 +2944,6 @@
         </w:tc>
       </w:tr>
       <w:tr>
-        <w:tblPrEx>
-          <w:tblCellMar>
-            <w:top w:w="0" w:type="dxa"/>
-            <w:bottom w:w="0" w:type="dxa"/>
-          </w:tblCellMar>
-        </w:tblPrEx>
         <w:tc>
           <w:tcPr>
             <w:tcW w:w="2400" w:type="dxa"/>
@@ -2913,12 +3002,6 @@
         </w:tc>
       </w:tr>
       <w:tr>
-        <w:tblPrEx>
-          <w:tblCellMar>
-            <w:top w:w="0" w:type="dxa"/>
-            <w:bottom w:w="0" w:type="dxa"/>
-          </w:tblCellMar>
-        </w:tblPrEx>
         <w:tc>
           <w:tcPr>
             <w:tcW w:w="2400" w:type="dxa"/>
@@ -3026,12 +3109,6 @@
         <w:gridCol w:w="2360"/>
       </w:tblGrid>
       <w:tr>
-        <w:tblPrEx>
-          <w:tblCellMar>
-            <w:top w:w="0" w:type="dxa"/>
-            <w:bottom w:w="0" w:type="dxa"/>
-          </w:tblCellMar>
-        </w:tblPrEx>
         <w:trPr>
           <w:tblHeader/>
         </w:trPr>
@@ -3157,12 +3234,6 @@
         </w:tc>
       </w:tr>
       <w:tr>
-        <w:tblPrEx>
-          <w:tblCellMar>
-            <w:top w:w="0" w:type="dxa"/>
-            <w:bottom w:w="0" w:type="dxa"/>
-          </w:tblCellMar>
-        </w:tblPrEx>
         <w:tc>
           <w:tcPr>
             <w:tcW w:w="2600" w:type="dxa"/>
@@ -3273,12 +3344,6 @@
         </w:tc>
       </w:tr>
       <w:tr>
-        <w:tblPrEx>
-          <w:tblCellMar>
-            <w:top w:w="0" w:type="dxa"/>
-            <w:bottom w:w="0" w:type="dxa"/>
-          </w:tblCellMar>
-        </w:tblPrEx>
         <w:tc>
           <w:tcPr>
             <w:tcW w:w="2600" w:type="dxa"/>
@@ -3393,12 +3458,6 @@
         </w:tc>
       </w:tr>
       <w:tr>
-        <w:tblPrEx>
-          <w:tblCellMar>
-            <w:top w:w="0" w:type="dxa"/>
-            <w:bottom w:w="0" w:type="dxa"/>
-          </w:tblCellMar>
-        </w:tblPrEx>
         <w:tc>
           <w:tcPr>
             <w:tcW w:w="2600" w:type="dxa"/>
@@ -3509,12 +3568,6 @@
         </w:tc>
       </w:tr>
       <w:tr>
-        <w:tblPrEx>
-          <w:tblCellMar>
-            <w:top w:w="0" w:type="dxa"/>
-            <w:bottom w:w="0" w:type="dxa"/>
-          </w:tblCellMar>
-        </w:tblPrEx>
         <w:tc>
           <w:tcPr>
             <w:tcW w:w="2600" w:type="dxa"/>
@@ -3725,10 +3778,23 @@
         <w:spacing w:after="120" w:line="300" w:lineRule="auto"/>
       </w:pPr>
       <w:r>
-        <w:t>The histogram shows the final score of every comment, coloured by label. The dashed lines mark the +/-0.15 thresholds. The tall bar near -0.6 is expected: the boycott and sarcasm rules set a minimum negative score of -0.6 for matching comments, so many com</w:t>
-      </w:r>
-      <w:r>
-        <w:t>ments land on that value. It is a property of the rules, not a natural cluster in the data.</w:t>
+        <w:t xml:space="preserve">The histogram shows the final score of every comment, </w:t>
+      </w:r>
+      <w:proofErr w:type="spellStart"/>
+      <w:r>
+        <w:t>coloured</w:t>
+      </w:r>
+      <w:proofErr w:type="spellEnd"/>
+      <w:r>
+        <w:t xml:space="preserve"> by label. The dashed lines mark </w:t>
+      </w:r>
+      <w:proofErr w:type="gramStart"/>
+      <w:r>
+        <w:t>the +/-</w:t>
+      </w:r>
+      <w:proofErr w:type="gramEnd"/>
+      <w:r>
+        <w:t>0.15 thresholds. The tall bar near -0.6 is expected: the boycott and sarcasm rules set a minimum negative score of -0.6 for matching comments, so many comments land on that value. It is a property of the rules, not a natural cluster in the data.</w:t>
       </w:r>
     </w:p>
     <w:p>
@@ -3814,10 +3880,7 @@
       </w:pPr>
       <w:r>
         <w:lastRenderedPageBreak/>
-        <w:t>Negative comments are longer than the others. The mean length is 17.9 words for Negative, 12.9 for P</w:t>
-      </w:r>
-      <w:r>
-        <w:t>ositive and 11.4 for Neutral. Viewers who disagree with the video tend to explain their reasons, while Neutral comments are often short memes, timestamps or questions.</w:t>
+        <w:t>Negative comments are longer than the others. The mean length is 17.9 words for Negative, 12.9 for Positive and 11.4 for Neutral. Viewers who disagree with the video tend to explain their reasons, while Neutral comments are often short memes, timestamps or questions.</w:t>
       </w:r>
     </w:p>
     <w:p>
@@ -3968,17 +4031,7 @@
           <w:sz w:val="19"/>
           <w:szCs w:val="19"/>
         </w:rPr>
-        <w:t>Figure 4</w:t>
-      </w:r>
-      <w:r>
-        <w:rPr>
-          <w:i/>
-          <w:iCs/>
-          <w:color w:val="595959"/>
-          <w:sz w:val="19"/>
-          <w:szCs w:val="19"/>
-        </w:rPr>
-        <w:t>: Comments over time by sentiment</w:t>
+        <w:t>Figure 4: Comments over time by sentiment</w:t>
       </w:r>
     </w:p>
     <w:p>
@@ -3998,10 +4051,23 @@
       </w:pPr>
       <w:r>
         <w:lastRenderedPageBreak/>
-        <w:t>Instead of raw word counts, the chart ranks words by how much more often they appear in one sentiment class than in the whole dataset (count multiplied by log-lift). Words shared by all classes, Engli</w:t>
-      </w:r>
-      <w:r>
-        <w:t>sh and Roman Urdu stopwords, and optional brand words given with --stopwords are removed.</w:t>
+        <w:t xml:space="preserve">Instead of raw word counts, the chart ranks words by how much more often they appear in one sentiment class than in the whole dataset (count multiplied by log-lift). Words shared by all classes, English and Roman Urdu </w:t>
+      </w:r>
+      <w:proofErr w:type="spellStart"/>
+      <w:r>
+        <w:t>stopwords</w:t>
+      </w:r>
+      <w:proofErr w:type="spellEnd"/>
+      <w:r>
+        <w:t>, and optional brand words given with --</w:t>
+      </w:r>
+      <w:proofErr w:type="spellStart"/>
+      <w:r>
+        <w:t>stopwords</w:t>
+      </w:r>
+      <w:proofErr w:type="spellEnd"/>
+      <w:r>
+        <w:t xml:space="preserve"> are removed.</w:t>
       </w:r>
     </w:p>
     <w:p>
@@ -4092,12 +4158,6 @@
         <w:gridCol w:w="7560"/>
       </w:tblGrid>
       <w:tr>
-        <w:tblPrEx>
-          <w:tblCellMar>
-            <w:top w:w="0" w:type="dxa"/>
-            <w:bottom w:w="0" w:type="dxa"/>
-          </w:tblCellMar>
-        </w:tblPrEx>
         <w:trPr>
           <w:tblHeader/>
         </w:trPr>
@@ -4163,12 +4223,6 @@
         </w:tc>
       </w:tr>
       <w:tr>
-        <w:tblPrEx>
-          <w:tblCellMar>
-            <w:top w:w="0" w:type="dxa"/>
-            <w:bottom w:w="0" w:type="dxa"/>
-          </w:tblCellMar>
-        </w:tblPrEx>
         <w:tc>
           <w:tcPr>
             <w:tcW w:w="1800" w:type="dxa"/>
@@ -4225,12 +4279,6 @@
         </w:tc>
       </w:tr>
       <w:tr>
-        <w:tblPrEx>
-          <w:tblCellMar>
-            <w:top w:w="0" w:type="dxa"/>
-            <w:bottom w:w="0" w:type="dxa"/>
-          </w:tblCellMar>
-        </w:tblPrEx>
         <w:tc>
           <w:tcPr>
             <w:tcW w:w="1800" w:type="dxa"/>
@@ -4283,18 +4331,30 @@
                 <w:sz w:val="20"/>
                 <w:szCs w:val="20"/>
               </w:rPr>
-              <w:t>meme (32), boys (25), lol (19), tomorrow (13), dislikes (14), likes (8), today (14), haha (6), girls (7), memes (5)</w:t>
+              <w:t xml:space="preserve">meme (32), boys (25), lol (19), tomorrow (13), dislikes (14), likes (8), today (14), </w:t>
+            </w:r>
+            <w:proofErr w:type="spellStart"/>
+            <w:r>
+              <w:rPr>
+                <w:color w:val="000000"/>
+                <w:sz w:val="20"/>
+                <w:szCs w:val="20"/>
+              </w:rPr>
+              <w:t>haha</w:t>
+            </w:r>
+            <w:proofErr w:type="spellEnd"/>
+            <w:r>
+              <w:rPr>
+                <w:color w:val="000000"/>
+                <w:sz w:val="20"/>
+                <w:szCs w:val="20"/>
+              </w:rPr>
+              <w:t xml:space="preserve"> (6), girls (7), memes (5)</w:t>
             </w:r>
           </w:p>
         </w:tc>
       </w:tr>
       <w:tr>
-        <w:tblPrEx>
-          <w:tblCellMar>
-            <w:top w:w="0" w:type="dxa"/>
-            <w:bottom w:w="0" w:type="dxa"/>
-          </w:tblCellMar>
-        </w:tblPrEx>
         <w:tc>
           <w:tcPr>
             <w:tcW w:w="1800" w:type="dxa"/>
@@ -4397,12 +4457,6 @@
         <w:gridCol w:w="5160"/>
       </w:tblGrid>
       <w:tr>
-        <w:tblPrEx>
-          <w:tblCellMar>
-            <w:top w:w="0" w:type="dxa"/>
-            <w:bottom w:w="0" w:type="dxa"/>
-          </w:tblCellMar>
-        </w:tblPrEx>
         <w:trPr>
           <w:tblHeader/>
         </w:trPr>
@@ -4468,12 +4522,6 @@
         </w:tc>
       </w:tr>
       <w:tr>
-        <w:tblPrEx>
-          <w:tblCellMar>
-            <w:top w:w="0" w:type="dxa"/>
-            <w:bottom w:w="0" w:type="dxa"/>
-          </w:tblCellMar>
-        </w:tblPrEx>
         <w:tc>
           <w:tcPr>
             <w:tcW w:w="4200" w:type="dxa"/>
@@ -4530,12 +4578,6 @@
         </w:tc>
       </w:tr>
       <w:tr>
-        <w:tblPrEx>
-          <w:tblCellMar>
-            <w:top w:w="0" w:type="dxa"/>
-            <w:bottom w:w="0" w:type="dxa"/>
-          </w:tblCellMar>
-        </w:tblPrEx>
         <w:tc>
           <w:tcPr>
             <w:tcW w:w="4200" w:type="dxa"/>
@@ -4594,12 +4636,6 @@
         </w:tc>
       </w:tr>
       <w:tr>
-        <w:tblPrEx>
-          <w:tblCellMar>
-            <w:top w:w="0" w:type="dxa"/>
-            <w:bottom w:w="0" w:type="dxa"/>
-          </w:tblCellMar>
-        </w:tblPrEx>
         <w:tc>
           <w:tcPr>
             <w:tcW w:w="4200" w:type="dxa"/>
@@ -4656,12 +4692,6 @@
         </w:tc>
       </w:tr>
       <w:tr>
-        <w:tblPrEx>
-          <w:tblCellMar>
-            <w:top w:w="0" w:type="dxa"/>
-            <w:bottom w:w="0" w:type="dxa"/>
-          </w:tblCellMar>
-        </w:tblPrEx>
         <w:tc>
           <w:tcPr>
             <w:tcW w:w="4200" w:type="dxa"/>
@@ -4745,10 +4775,7 @@
       </w:r>
       <w:r>
         <w:lastRenderedPageBreak/>
-        <w:t>on its stance toward the advertisement and brand. The com</w:t>
-      </w:r>
-      <w:r>
-        <w:t>mand python main.py --evaluate review_sample_labeled.csv compares these labels with classified_comments.csv by comment ID.</w:t>
+        <w:t>on its stance toward the advertisement and brand. The command python main.py --evaluate review_sample_labeled.csv compares these labels with classified_comments.csv by comment ID.</w:t>
       </w:r>
     </w:p>
     <w:tbl>
@@ -4773,12 +4800,6 @@
         <w:gridCol w:w="4660"/>
       </w:tblGrid>
       <w:tr>
-        <w:tblPrEx>
-          <w:tblCellMar>
-            <w:top w:w="0" w:type="dxa"/>
-            <w:bottom w:w="0" w:type="dxa"/>
-          </w:tblCellMar>
-        </w:tblPrEx>
         <w:trPr>
           <w:tblHeader/>
         </w:trPr>
@@ -4844,12 +4865,6 @@
         </w:tc>
       </w:tr>
       <w:tr>
-        <w:tblPrEx>
-          <w:tblCellMar>
-            <w:top w:w="0" w:type="dxa"/>
-            <w:bottom w:w="0" w:type="dxa"/>
-          </w:tblCellMar>
-        </w:tblPrEx>
         <w:tc>
           <w:tcPr>
             <w:tcW w:w="4700" w:type="dxa"/>
@@ -4873,7 +4888,25 @@
                 <w:sz w:val="20"/>
                 <w:szCs w:val="20"/>
               </w:rPr>
-              <w:t>First version (XLM-RoBERTa and lexicon, no stance rules)</w:t>
+              <w:t>First version (XLM-</w:t>
+            </w:r>
+            <w:proofErr w:type="spellStart"/>
+            <w:r>
+              <w:rPr>
+                <w:color w:val="000000"/>
+                <w:sz w:val="20"/>
+                <w:szCs w:val="20"/>
+              </w:rPr>
+              <w:t>RoBERTa</w:t>
+            </w:r>
+            <w:proofErr w:type="spellEnd"/>
+            <w:r>
+              <w:rPr>
+                <w:color w:val="000000"/>
+                <w:sz w:val="20"/>
+                <w:szCs w:val="20"/>
+              </w:rPr>
+              <w:t xml:space="preserve"> and lexicon, no stance rules)</w:t>
             </w:r>
           </w:p>
         </w:tc>
@@ -4906,12 +4939,6 @@
         </w:tc>
       </w:tr>
       <w:tr>
-        <w:tblPrEx>
-          <w:tblCellMar>
-            <w:top w:w="0" w:type="dxa"/>
-            <w:bottom w:w="0" w:type="dxa"/>
-          </w:tblCellMar>
-        </w:tblPrEx>
         <w:tc>
           <w:tcPr>
             <w:tcW w:w="4700" w:type="dxa"/>
@@ -4970,12 +4997,6 @@
         </w:tc>
       </w:tr>
       <w:tr>
-        <w:tblPrEx>
-          <w:tblCellMar>
-            <w:top w:w="0" w:type="dxa"/>
-            <w:bottom w:w="0" w:type="dxa"/>
-          </w:tblCellMar>
-        </w:tblPrEx>
         <w:tc>
           <w:tcPr>
             <w:tcW w:w="4700" w:type="dxa"/>
@@ -5049,10 +5070,7 @@
         <w:t xml:space="preserve">Important note: </w:t>
       </w:r>
       <w:r>
-        <w:t>the manual labels were created by the project author, and the rules were tuned while looking at the same 105 comments, so the 72% figure is likely optimistic. A fair estimate for the local engine on new comments is roughly 65% to 70%. The result is accepta</w:t>
-      </w:r>
-      <w:r>
-        <w:t>ble for exploratory analysis, but it is not above 80%.</w:t>
+        <w:t>the manual labels were created by the project author, and the rules were tuned while looking at the same 105 comments, so the 72% figure is likely optimistic. A fair estimate for the local engine on new comments is roughly 65% to 70%. The result is acceptable for exploratory analysis, but it is not above 80%.</w:t>
       </w:r>
     </w:p>
     <w:p>
@@ -5089,10 +5107,7 @@
         <w:spacing w:after="70"/>
       </w:pPr>
       <w:r>
-        <w:t>The Positive class is the weakest, because many apparently posit</w:t>
-      </w:r>
-      <w:r>
-        <w:t>ive comments are really mocking the video.</w:t>
+        <w:t>The Positive class is the weakest, because many apparently positive comments are really mocking the video.</w:t>
       </w:r>
     </w:p>
     <w:p>
@@ -5129,10 +5144,15 @@
         <w:spacing w:after="70"/>
       </w:pPr>
       <w:r>
-        <w:t>All results in this report come from one video, so they describe reaction to one advertisement an</w:t>
-      </w:r>
-      <w:r>
-        <w:t>d should not be generalised.</w:t>
+        <w:t xml:space="preserve">All results in this report come from one video, so they describe reaction to one advertisement and should not be </w:t>
+      </w:r>
+      <w:proofErr w:type="spellStart"/>
+      <w:r>
+        <w:t>generalised</w:t>
+      </w:r>
+      <w:proofErr w:type="spellEnd"/>
+      <w:r>
+        <w:t>.</w:t>
       </w:r>
     </w:p>
     <w:p>
@@ -5171,10 +5191,7 @@
         <w:spacing w:after="70"/>
       </w:pPr>
       <w:r>
-        <w:t>The stance rules and the competitor list were written for a brand-backlash thread</w:t>
-      </w:r>
-      <w:r>
-        <w:t xml:space="preserve"> and need to be edited for other brands.</w:t>
+        <w:t>The stance rules and the competitor list were written for a brand-backlash thread and need to be edited for other brands.</w:t>
       </w:r>
     </w:p>
     <w:p>
@@ -5187,7 +5204,15 @@
         <w:spacing w:after="70"/>
       </w:pPr>
       <w:r>
-        <w:t>Chart labels in Urdu and Hindi script may not render with Arabic-style joining in matplotlib.</w:t>
+        <w:t xml:space="preserve">Chart labels in Urdu and Hindi script may not render with Arabic-style joining in </w:t>
+      </w:r>
+      <w:proofErr w:type="spellStart"/>
+      <w:r>
+        <w:t>matplotlib</w:t>
+      </w:r>
+      <w:proofErr w:type="spellEnd"/>
+      <w:r>
+        <w:t>.</w:t>
       </w:r>
     </w:p>
     <w:p>
@@ -5200,7 +5225,15 @@
         <w:spacing w:after="70"/>
       </w:pPr>
       <w:r>
-        <w:t>The first run of the XLM-RoBERTa model downloads about 1 GB.</w:t>
+        <w:t>The first run of the XLM-</w:t>
+      </w:r>
+      <w:proofErr w:type="spellStart"/>
+      <w:r>
+        <w:t>RoBERTa</w:t>
+      </w:r>
+      <w:proofErr w:type="spellEnd"/>
+      <w:r>
+        <w:t xml:space="preserve"> model downloads about 1 GB.</w:t>
       </w:r>
     </w:p>
     <w:p>
@@ -5230,34 +5263,30 @@
         <w:shd w:val="clear" w:color="auto" w:fill="F2F2F2"/>
         <w:ind w:left="200" w:right="200"/>
       </w:pPr>
+      <w:proofErr w:type="gramStart"/>
       <w:r>
         <w:rPr>
           <w:rFonts w:ascii="Consolas" w:eastAsia="Consolas" w:hAnsi="Consolas" w:cs="Consolas"/>
           <w:sz w:val="19"/>
           <w:szCs w:val="19"/>
         </w:rPr>
-        <w:t>pip install -r requirements.txt</w:t>
-      </w:r>
-    </w:p>
-    <w:p>
-      <w:pPr>
-        <w:shd w:val="clear" w:color="auto" w:fill="F2F2F2"/>
-        <w:ind w:left="200" w:right="200"/>
-      </w:pPr>
-    </w:p>
-    <w:p>
-      <w:pPr>
-        <w:shd w:val="clear" w:color="auto" w:fill="F2F2F2"/>
-        <w:ind w:left="200" w:right="200"/>
-      </w:pPr>
+        <w:t>pip</w:t>
+      </w:r>
+      <w:proofErr w:type="gramEnd"/>
       <w:r>
         <w:rPr>
           <w:rFonts w:ascii="Consolas" w:eastAsia="Consolas" w:hAnsi="Consolas" w:cs="Consolas"/>
           <w:sz w:val="19"/>
           <w:szCs w:val="19"/>
         </w:rPr>
-        <w:t># create a file named .env in the project folder</w:t>
-      </w:r>
+        <w:t xml:space="preserve"> install -r requirements.txt</w:t>
+      </w:r>
+    </w:p>
+    <w:p>
+      <w:pPr>
+        <w:shd w:val="clear" w:color="auto" w:fill="F2F2F2"/>
+        <w:ind w:left="200" w:right="200"/>
+      </w:pPr>
     </w:p>
     <w:p>
       <w:pPr>
@@ -5270,74 +5299,25 @@
           <w:sz w:val="19"/>
           <w:szCs w:val="19"/>
         </w:rPr>
-        <w:t>YOUTUBE_API_KEY=your_youtube_key</w:t>
-      </w:r>
-    </w:p>
-    <w:p>
-      <w:pPr>
-        <w:shd w:val="clear" w:color="auto" w:fill="F2F2F2"/>
-        <w:ind w:left="200" w:right="200"/>
-      </w:pPr>
+        <w:t># create a file named .</w:t>
+      </w:r>
+      <w:proofErr w:type="spellStart"/>
       <w:r>
         <w:rPr>
           <w:rFonts w:ascii="Consolas" w:eastAsia="Consolas" w:hAnsi="Consolas" w:cs="Consolas"/>
           <w:sz w:val="19"/>
           <w:szCs w:val="19"/>
         </w:rPr>
-        <w:t>ANTHROPIC_API_KEY=your_key        # only for --engine claude</w:t>
-      </w:r>
-    </w:p>
-    <w:p>
-      <w:pPr>
-        <w:spacing w:after="100"/>
-      </w:pPr>
-    </w:p>
-    <w:p>
-      <w:pPr>
-        <w:pStyle w:val="Heading2"/>
-      </w:pPr>
-      <w:r>
-        <w:rPr>
-          <w:color w:val="2E74B5"/>
-        </w:rPr>
-        <w:lastRenderedPageBreak/>
-        <w:t>10.2 Step 1: collect comments</w:t>
-      </w:r>
-    </w:p>
-    <w:p>
-      <w:pPr>
-        <w:shd w:val="clear" w:color="auto" w:fill="F2F2F2"/>
-        <w:ind w:left="200" w:right="200"/>
-      </w:pPr>
+        <w:t>env</w:t>
+      </w:r>
+      <w:proofErr w:type="spellEnd"/>
       <w:r>
         <w:rPr>
           <w:rFonts w:ascii="Consolas" w:eastAsia="Consolas" w:hAnsi="Consolas" w:cs="Consolas"/>
           <w:sz w:val="19"/>
           <w:szCs w:val="19"/>
         </w:rPr>
-        <w:t>python fetch.py --videos URL1 URL2 --max-comments 1500</w:t>
-      </w:r>
-    </w:p>
-    <w:p>
-      <w:pPr>
-        <w:spacing w:after="120" w:line="300" w:lineRule="auto"/>
-      </w:pPr>
-      <w:r>
-        <w:t>The comments are saved to o</w:t>
-      </w:r>
-      <w:r>
-        <w:t>utput/raw_comments.csv. Run the command again with other videos to add more comments without duplicates.</w:t>
-      </w:r>
-    </w:p>
-    <w:p>
-      <w:pPr>
-        <w:pStyle w:val="Heading2"/>
-      </w:pPr>
-      <w:r>
-        <w:rPr>
-          <w:color w:val="2E74B5"/>
-        </w:rPr>
-        <w:t>10.3 Step 2: analyse sentiment</w:t>
+        <w:t xml:space="preserve"> in the project folder</w:t>
       </w:r>
     </w:p>
     <w:p>
@@ -5351,74 +5331,310 @@
           <w:sz w:val="19"/>
           <w:szCs w:val="19"/>
         </w:rPr>
-        <w:t>python main.py --input output/raw_comments.csv --stopwords brandname razor</w:t>
-      </w:r>
-    </w:p>
-    <w:p>
-      <w:pPr>
-        <w:shd w:val="clear" w:color="auto" w:fill="F2F2F2"/>
-        <w:ind w:left="200" w:right="200"/>
-      </w:pPr>
-    </w:p>
-    <w:p>
-      <w:pPr>
-        <w:shd w:val="clear" w:color="auto" w:fill="F2F2F2"/>
-        <w:ind w:left="200" w:right="200"/>
-      </w:pPr>
+        <w:t>YOUTUBE_API_KEY=</w:t>
+      </w:r>
+      <w:proofErr w:type="spellStart"/>
       <w:r>
         <w:rPr>
           <w:rFonts w:ascii="Consolas" w:eastAsia="Consolas" w:hAnsi="Consolas" w:cs="Consolas"/>
           <w:sz w:val="19"/>
           <w:szCs w:val="19"/>
         </w:rPr>
-        <w:t># best accuracy for sarcasm (needs ANTHROPIC</w:t>
-      </w:r>
+        <w:t>your_youtube_key</w:t>
+      </w:r>
+      <w:proofErr w:type="spellEnd"/>
+    </w:p>
+    <w:p>
+      <w:pPr>
+        <w:shd w:val="clear" w:color="auto" w:fill="F2F2F2"/>
+        <w:ind w:left="200" w:right="200"/>
+      </w:pPr>
       <w:r>
         <w:rPr>
           <w:rFonts w:ascii="Consolas" w:eastAsia="Consolas" w:hAnsi="Consolas" w:cs="Consolas"/>
           <w:sz w:val="19"/>
           <w:szCs w:val="19"/>
         </w:rPr>
-        <w:t>_API_KEY)</w:t>
-      </w:r>
-    </w:p>
-    <w:p>
-      <w:pPr>
-        <w:shd w:val="clear" w:color="auto" w:fill="F2F2F2"/>
-        <w:ind w:left="200" w:right="200"/>
-      </w:pPr>
+        <w:t>ANTHROPIC_API_KEY=</w:t>
+      </w:r>
+      <w:proofErr w:type="spellStart"/>
       <w:r>
         <w:rPr>
           <w:rFonts w:ascii="Consolas" w:eastAsia="Consolas" w:hAnsi="Consolas" w:cs="Consolas"/>
           <w:sz w:val="19"/>
           <w:szCs w:val="19"/>
         </w:rPr>
-        <w:t>python main.py --engine claude --target "the brand advertisement"</w:t>
-      </w:r>
-    </w:p>
-    <w:p>
-      <w:pPr>
-        <w:pStyle w:val="Heading2"/>
-      </w:pPr>
-      <w:r>
-        <w:rPr>
-          <w:color w:val="2E74B5"/>
-        </w:rPr>
-        <w:t>10.4 Step 3: measure accuracy</w:t>
-      </w:r>
-    </w:p>
-    <w:p>
-      <w:pPr>
-        <w:shd w:val="clear" w:color="auto" w:fill="F2F2F2"/>
-        <w:ind w:left="200" w:right="200"/>
-      </w:pPr>
+        <w:t>your_key</w:t>
+      </w:r>
+      <w:proofErr w:type="spellEnd"/>
       <w:r>
         <w:rPr>
           <w:rFonts w:ascii="Consolas" w:eastAsia="Consolas" w:hAnsi="Consolas" w:cs="Consolas"/>
           <w:sz w:val="19"/>
           <w:szCs w:val="19"/>
         </w:rPr>
-        <w:t>python main.py --evaluate review_sample_labeled.csv</w:t>
+        <w:t xml:space="preserve">        # only for --engine </w:t>
+      </w:r>
+      <w:proofErr w:type="spellStart"/>
+      <w:proofErr w:type="gramStart"/>
+      <w:r>
+        <w:rPr>
+          <w:rFonts w:ascii="Consolas" w:eastAsia="Consolas" w:hAnsi="Consolas" w:cs="Consolas"/>
+          <w:sz w:val="19"/>
+          <w:szCs w:val="19"/>
+        </w:rPr>
+        <w:t>claude</w:t>
+      </w:r>
+      <w:proofErr w:type="spellEnd"/>
+      <w:proofErr w:type="gramEnd"/>
+    </w:p>
+    <w:p>
+      <w:pPr>
+        <w:spacing w:after="100"/>
+      </w:pPr>
+    </w:p>
+    <w:p>
+      <w:pPr>
+        <w:pStyle w:val="Heading2"/>
+      </w:pPr>
+      <w:r>
+        <w:rPr>
+          <w:color w:val="2E74B5"/>
+        </w:rPr>
+        <w:lastRenderedPageBreak/>
+        <w:t>10.2 Step 1: collect comments</w:t>
+      </w:r>
+    </w:p>
+    <w:p>
+      <w:pPr>
+        <w:shd w:val="clear" w:color="auto" w:fill="F2F2F2"/>
+        <w:ind w:left="200" w:right="200"/>
+      </w:pPr>
+      <w:proofErr w:type="gramStart"/>
+      <w:r>
+        <w:rPr>
+          <w:rFonts w:ascii="Consolas" w:eastAsia="Consolas" w:hAnsi="Consolas" w:cs="Consolas"/>
+          <w:sz w:val="19"/>
+          <w:szCs w:val="19"/>
+        </w:rPr>
+        <w:t>python</w:t>
+      </w:r>
+      <w:proofErr w:type="gramEnd"/>
+      <w:r>
+        <w:rPr>
+          <w:rFonts w:ascii="Consolas" w:eastAsia="Consolas" w:hAnsi="Consolas" w:cs="Consolas"/>
+          <w:sz w:val="19"/>
+          <w:szCs w:val="19"/>
+        </w:rPr>
+        <w:t xml:space="preserve"> fetch.py --videos URL1 URL2 --max-comments 1500</w:t>
+      </w:r>
+    </w:p>
+    <w:p>
+      <w:pPr>
+        <w:spacing w:after="120" w:line="300" w:lineRule="auto"/>
+      </w:pPr>
+      <w:r>
+        <w:t>The comments are saved to output/raw_comments.csv. Run the command again with other videos to add more comments without duplicates.</w:t>
+      </w:r>
+    </w:p>
+    <w:p>
+      <w:pPr>
+        <w:pStyle w:val="Heading2"/>
+      </w:pPr>
+      <w:r>
+        <w:rPr>
+          <w:color w:val="2E74B5"/>
+        </w:rPr>
+        <w:t xml:space="preserve">10.3 Step 2: </w:t>
+      </w:r>
+      <w:proofErr w:type="spellStart"/>
+      <w:r>
+        <w:rPr>
+          <w:color w:val="2E74B5"/>
+        </w:rPr>
+        <w:t>analyse</w:t>
+      </w:r>
+      <w:proofErr w:type="spellEnd"/>
+      <w:r>
+        <w:rPr>
+          <w:color w:val="2E74B5"/>
+        </w:rPr>
+        <w:t xml:space="preserve"> sentiment</w:t>
+      </w:r>
+    </w:p>
+    <w:p>
+      <w:pPr>
+        <w:shd w:val="clear" w:color="auto" w:fill="F2F2F2"/>
+        <w:ind w:left="200" w:right="200"/>
+      </w:pPr>
+      <w:proofErr w:type="gramStart"/>
+      <w:r>
+        <w:rPr>
+          <w:rFonts w:ascii="Consolas" w:eastAsia="Consolas" w:hAnsi="Consolas" w:cs="Consolas"/>
+          <w:sz w:val="19"/>
+          <w:szCs w:val="19"/>
+        </w:rPr>
+        <w:t>python</w:t>
+      </w:r>
+      <w:proofErr w:type="gramEnd"/>
+      <w:r>
+        <w:rPr>
+          <w:rFonts w:ascii="Consolas" w:eastAsia="Consolas" w:hAnsi="Consolas" w:cs="Consolas"/>
+          <w:sz w:val="19"/>
+          <w:szCs w:val="19"/>
+        </w:rPr>
+        <w:t xml:space="preserve"> main.py --input output/raw_comments.csv --</w:t>
+      </w:r>
+      <w:proofErr w:type="spellStart"/>
+      <w:r>
+        <w:rPr>
+          <w:rFonts w:ascii="Consolas" w:eastAsia="Consolas" w:hAnsi="Consolas" w:cs="Consolas"/>
+          <w:sz w:val="19"/>
+          <w:szCs w:val="19"/>
+        </w:rPr>
+        <w:t>stopwords</w:t>
+      </w:r>
+      <w:proofErr w:type="spellEnd"/>
+      <w:r>
+        <w:rPr>
+          <w:rFonts w:ascii="Consolas" w:eastAsia="Consolas" w:hAnsi="Consolas" w:cs="Consolas"/>
+          <w:sz w:val="19"/>
+          <w:szCs w:val="19"/>
+        </w:rPr>
+        <w:t xml:space="preserve"> </w:t>
+      </w:r>
+      <w:proofErr w:type="spellStart"/>
+      <w:r>
+        <w:rPr>
+          <w:rFonts w:ascii="Consolas" w:eastAsia="Consolas" w:hAnsi="Consolas" w:cs="Consolas"/>
+          <w:sz w:val="19"/>
+          <w:szCs w:val="19"/>
+        </w:rPr>
+        <w:t>brandname</w:t>
+      </w:r>
+      <w:proofErr w:type="spellEnd"/>
+      <w:r>
+        <w:rPr>
+          <w:rFonts w:ascii="Consolas" w:eastAsia="Consolas" w:hAnsi="Consolas" w:cs="Consolas"/>
+          <w:sz w:val="19"/>
+          <w:szCs w:val="19"/>
+        </w:rPr>
+        <w:t xml:space="preserve"> razor</w:t>
+      </w:r>
+    </w:p>
+    <w:p>
+      <w:pPr>
+        <w:shd w:val="clear" w:color="auto" w:fill="F2F2F2"/>
+        <w:ind w:left="200" w:right="200"/>
+      </w:pPr>
+    </w:p>
+    <w:p>
+      <w:pPr>
+        <w:shd w:val="clear" w:color="auto" w:fill="F2F2F2"/>
+        <w:ind w:left="200" w:right="200"/>
+      </w:pPr>
+      <w:r>
+        <w:rPr>
+          <w:rFonts w:ascii="Consolas" w:eastAsia="Consolas" w:hAnsi="Consolas" w:cs="Consolas"/>
+          <w:sz w:val="19"/>
+          <w:szCs w:val="19"/>
+        </w:rPr>
+        <w:t xml:space="preserve"># </w:t>
+      </w:r>
+      <w:proofErr w:type="gramStart"/>
+      <w:r>
+        <w:rPr>
+          <w:rFonts w:ascii="Consolas" w:eastAsia="Consolas" w:hAnsi="Consolas" w:cs="Consolas"/>
+          <w:sz w:val="19"/>
+          <w:szCs w:val="19"/>
+        </w:rPr>
+        <w:t>best</w:t>
+      </w:r>
+      <w:proofErr w:type="gramEnd"/>
+      <w:r>
+        <w:rPr>
+          <w:rFonts w:ascii="Consolas" w:eastAsia="Consolas" w:hAnsi="Consolas" w:cs="Consolas"/>
+          <w:sz w:val="19"/>
+          <w:szCs w:val="19"/>
+        </w:rPr>
+        <w:t xml:space="preserve"> accuracy for sarcasm (needs ANTHROPIC_API_KEY)</w:t>
+      </w:r>
+    </w:p>
+    <w:p>
+      <w:pPr>
+        <w:shd w:val="clear" w:color="auto" w:fill="F2F2F2"/>
+        <w:ind w:left="200" w:right="200"/>
+      </w:pPr>
+      <w:proofErr w:type="gramStart"/>
+      <w:r>
+        <w:rPr>
+          <w:rFonts w:ascii="Consolas" w:eastAsia="Consolas" w:hAnsi="Consolas" w:cs="Consolas"/>
+          <w:sz w:val="19"/>
+          <w:szCs w:val="19"/>
+        </w:rPr>
+        <w:t>python</w:t>
+      </w:r>
+      <w:proofErr w:type="gramEnd"/>
+      <w:r>
+        <w:rPr>
+          <w:rFonts w:ascii="Consolas" w:eastAsia="Consolas" w:hAnsi="Consolas" w:cs="Consolas"/>
+          <w:sz w:val="19"/>
+          <w:szCs w:val="19"/>
+        </w:rPr>
+        <w:t xml:space="preserve"> main.py --engine </w:t>
+      </w:r>
+      <w:proofErr w:type="spellStart"/>
+      <w:r>
+        <w:rPr>
+          <w:rFonts w:ascii="Consolas" w:eastAsia="Consolas" w:hAnsi="Consolas" w:cs="Consolas"/>
+          <w:sz w:val="19"/>
+          <w:szCs w:val="19"/>
+        </w:rPr>
+        <w:t>claude</w:t>
+      </w:r>
+      <w:proofErr w:type="spellEnd"/>
+      <w:r>
+        <w:rPr>
+          <w:rFonts w:ascii="Consolas" w:eastAsia="Consolas" w:hAnsi="Consolas" w:cs="Consolas"/>
+          <w:sz w:val="19"/>
+          <w:szCs w:val="19"/>
+        </w:rPr>
+        <w:t xml:space="preserve"> --target "the brand advertisement"</w:t>
+      </w:r>
+    </w:p>
+    <w:p>
+      <w:pPr>
+        <w:pStyle w:val="Heading2"/>
+      </w:pPr>
+      <w:r>
+        <w:rPr>
+          <w:color w:val="2E74B5"/>
+        </w:rPr>
+        <w:t>10.4 Step 3: measure accuracy</w:t>
+      </w:r>
+    </w:p>
+    <w:p>
+      <w:pPr>
+        <w:shd w:val="clear" w:color="auto" w:fill="F2F2F2"/>
+        <w:ind w:left="200" w:right="200"/>
+      </w:pPr>
+      <w:proofErr w:type="gramStart"/>
+      <w:r>
+        <w:rPr>
+          <w:rFonts w:ascii="Consolas" w:eastAsia="Consolas" w:hAnsi="Consolas" w:cs="Consolas"/>
+          <w:sz w:val="19"/>
+          <w:szCs w:val="19"/>
+        </w:rPr>
+        <w:t>python</w:t>
+      </w:r>
+      <w:proofErr w:type="gramEnd"/>
+      <w:r>
+        <w:rPr>
+          <w:rFonts w:ascii="Consolas" w:eastAsia="Consolas" w:hAnsi="Consolas" w:cs="Consolas"/>
+          <w:sz w:val="19"/>
+          <w:szCs w:val="19"/>
+        </w:rPr>
+        <w:t xml:space="preserve"> main.py --evaluate review_sample_labeled.csv</w:t>
       </w:r>
     </w:p>
     <w:p>
@@ -5454,12 +5670,6 @@
         <w:gridCol w:w="6560"/>
       </w:tblGrid>
       <w:tr>
-        <w:tblPrEx>
-          <w:tblCellMar>
-            <w:top w:w="0" w:type="dxa"/>
-            <w:bottom w:w="0" w:type="dxa"/>
-          </w:tblCellMar>
-        </w:tblPrEx>
         <w:trPr>
           <w:tblHeader/>
         </w:trPr>
@@ -5525,12 +5735,6 @@
         </w:tc>
       </w:tr>
       <w:tr>
-        <w:tblPrEx>
-          <w:tblCellMar>
-            <w:top w:w="0" w:type="dxa"/>
-            <w:bottom w:w="0" w:type="dxa"/>
-          </w:tblCellMar>
-        </w:tblPrEx>
         <w:tc>
           <w:tcPr>
             <w:tcW w:w="2800" w:type="dxa"/>
@@ -5581,18 +5785,30 @@
                 <w:sz w:val="20"/>
                 <w:szCs w:val="20"/>
               </w:rPr>
-              <w:t>Comments CSV to analyse (default output/raw_comments.csv)</w:t>
+              <w:t xml:space="preserve">Comments CSV to </w:t>
+            </w:r>
+            <w:proofErr w:type="spellStart"/>
+            <w:r>
+              <w:rPr>
+                <w:color w:val="000000"/>
+                <w:sz w:val="20"/>
+                <w:szCs w:val="20"/>
+              </w:rPr>
+              <w:t>analyse</w:t>
+            </w:r>
+            <w:proofErr w:type="spellEnd"/>
+            <w:r>
+              <w:rPr>
+                <w:color w:val="000000"/>
+                <w:sz w:val="20"/>
+                <w:szCs w:val="20"/>
+              </w:rPr>
+              <w:t xml:space="preserve"> (default output/raw_comments.csv)</w:t>
             </w:r>
           </w:p>
         </w:tc>
       </w:tr>
       <w:tr>
-        <w:tblPrEx>
-          <w:tblCellMar>
-            <w:top w:w="0" w:type="dxa"/>
-            <w:bottom w:w="0" w:type="dxa"/>
-          </w:tblCellMar>
-        </w:tblPrEx>
         <w:tc>
           <w:tcPr>
             <w:tcW w:w="2800" w:type="dxa"/>
@@ -5639,24 +5855,56 @@
             </w:tcMar>
           </w:tcPr>
           <w:p>
-            <w:r>
-              <w:rPr>
-                <w:color w:val="000000"/>
-                <w:sz w:val="20"/>
-                <w:szCs w:val="20"/>
-              </w:rPr>
-              <w:t>xlmr (default), vader or claude</w:t>
-            </w:r>
+            <w:proofErr w:type="spellStart"/>
+            <w:r>
+              <w:rPr>
+                <w:color w:val="000000"/>
+                <w:sz w:val="20"/>
+                <w:szCs w:val="20"/>
+              </w:rPr>
+              <w:t>xlmr</w:t>
+            </w:r>
+            <w:proofErr w:type="spellEnd"/>
+            <w:r>
+              <w:rPr>
+                <w:color w:val="000000"/>
+                <w:sz w:val="20"/>
+                <w:szCs w:val="20"/>
+              </w:rPr>
+              <w:t xml:space="preserve"> (default), </w:t>
+            </w:r>
+            <w:proofErr w:type="spellStart"/>
+            <w:r>
+              <w:rPr>
+                <w:color w:val="000000"/>
+                <w:sz w:val="20"/>
+                <w:szCs w:val="20"/>
+              </w:rPr>
+              <w:t>vader</w:t>
+            </w:r>
+            <w:proofErr w:type="spellEnd"/>
+            <w:r>
+              <w:rPr>
+                <w:color w:val="000000"/>
+                <w:sz w:val="20"/>
+                <w:szCs w:val="20"/>
+              </w:rPr>
+              <w:t xml:space="preserve"> or </w:t>
+            </w:r>
+            <w:proofErr w:type="spellStart"/>
+            <w:r>
+              <w:rPr>
+                <w:color w:val="000000"/>
+                <w:sz w:val="20"/>
+                <w:szCs w:val="20"/>
+              </w:rPr>
+              <w:t>claude</w:t>
+            </w:r>
+            <w:proofErr w:type="spellEnd"/>
           </w:p>
         </w:tc>
       </w:tr>
       <w:tr>
-        <w:tblPrEx>
-          <w:tblCellMar>
-            <w:top w:w="0" w:type="dxa"/>
-            <w:bottom w:w="0" w:type="dxa"/>
-          </w:tblCellMar>
-        </w:tblPrEx>
         <w:tc>
           <w:tcPr>
             <w:tcW w:w="2800" w:type="dxa"/>
@@ -5707,18 +5955,30 @@
                 <w:sz w:val="20"/>
                 <w:szCs w:val="20"/>
               </w:rPr>
-              <w:t>What the sentiment is about (used by the claude engine)</w:t>
+              <w:t xml:space="preserve">What the sentiment is about (used by the </w:t>
+            </w:r>
+            <w:proofErr w:type="spellStart"/>
+            <w:r>
+              <w:rPr>
+                <w:color w:val="000000"/>
+                <w:sz w:val="20"/>
+                <w:szCs w:val="20"/>
+              </w:rPr>
+              <w:t>claude</w:t>
+            </w:r>
+            <w:proofErr w:type="spellEnd"/>
+            <w:r>
+              <w:rPr>
+                <w:color w:val="000000"/>
+                <w:sz w:val="20"/>
+                <w:szCs w:val="20"/>
+              </w:rPr>
+              <w:t xml:space="preserve"> engine)</w:t>
             </w:r>
           </w:p>
         </w:tc>
       </w:tr>
       <w:tr>
-        <w:tblPrEx>
-          <w:tblCellMar>
-            <w:top w:w="0" w:type="dxa"/>
-            <w:bottom w:w="0" w:type="dxa"/>
-          </w:tblCellMar>
-        </w:tblPrEx>
         <w:tc>
           <w:tcPr>
             <w:tcW w:w="2800" w:type="dxa"/>
@@ -5777,12 +6037,6 @@
         </w:tc>
       </w:tr>
       <w:tr>
-        <w:tblPrEx>
-          <w:tblCellMar>
-            <w:top w:w="0" w:type="dxa"/>
-            <w:bottom w:w="0" w:type="dxa"/>
-          </w:tblCellMar>
-        </w:tblPrEx>
         <w:tc>
           <w:tcPr>
             <w:tcW w:w="2800" w:type="dxa"/>
@@ -5806,8 +6060,18 @@
                 <w:sz w:val="20"/>
                 <w:szCs w:val="20"/>
               </w:rPr>
-              <w:t>--stopwords</w:t>
-            </w:r>
+              <w:t>--</w:t>
+            </w:r>
+            <w:proofErr w:type="spellStart"/>
+            <w:r>
+              <w:rPr>
+                <w:color w:val="000000"/>
+                <w:sz w:val="20"/>
+                <w:szCs w:val="20"/>
+              </w:rPr>
+              <w:t>stopwords</w:t>
+            </w:r>
+            <w:proofErr w:type="spellEnd"/>
           </w:p>
         </w:tc>
         <w:tc>
@@ -5839,12 +6103,6 @@
         </w:tc>
       </w:tr>
       <w:tr>
-        <w:tblPrEx>
-          <w:tblCellMar>
-            <w:top w:w="0" w:type="dxa"/>
-            <w:bottom w:w="0" w:type="dxa"/>
-          </w:tblCellMar>
-        </w:tblPrEx>
         <w:tc>
           <w:tcPr>
             <w:tcW w:w="2800" w:type="dxa"/>
@@ -5869,8 +6127,18 @@
                 <w:sz w:val="20"/>
                 <w:szCs w:val="20"/>
               </w:rPr>
-              <w:t>--output-dir</w:t>
-            </w:r>
+              <w:t>--output-</w:t>
+            </w:r>
+            <w:proofErr w:type="spellStart"/>
+            <w:r>
+              <w:rPr>
+                <w:color w:val="000000"/>
+                <w:sz w:val="20"/>
+                <w:szCs w:val="20"/>
+              </w:rPr>
+              <w:t>dir</w:t>
+            </w:r>
+            <w:proofErr w:type="spellEnd"/>
           </w:p>
         </w:tc>
         <w:tc>
@@ -5903,12 +6171,6 @@
         </w:tc>
       </w:tr>
       <w:tr>
-        <w:tblPrEx>
-          <w:tblCellMar>
-            <w:top w:w="0" w:type="dxa"/>
-            <w:bottom w:w="0" w:type="dxa"/>
-          </w:tblCellMar>
-        </w:tblPrEx>
         <w:tc>
           <w:tcPr>
             <w:tcW w:w="2800" w:type="dxa"/>
@@ -5965,12 +6227,6 @@
         </w:tc>
       </w:tr>
       <w:tr>
-        <w:tblPrEx>
-          <w:tblCellMar>
-            <w:top w:w="0" w:type="dxa"/>
-            <w:bottom w:w="0" w:type="dxa"/>
-          </w:tblCellMar>
-        </w:tblPrEx>
         <w:tc>
           <w:tcPr>
             <w:tcW w:w="2800" w:type="dxa"/>
@@ -5995,7 +6251,25 @@
                 <w:sz w:val="20"/>
                 <w:szCs w:val="20"/>
               </w:rPr>
-              <w:t>python -m pytest tests</w:t>
+              <w:t xml:space="preserve">python -m </w:t>
+            </w:r>
+            <w:proofErr w:type="spellStart"/>
+            <w:r>
+              <w:rPr>
+                <w:color w:val="000000"/>
+                <w:sz w:val="20"/>
+                <w:szCs w:val="20"/>
+              </w:rPr>
+              <w:t>pytest</w:t>
+            </w:r>
+            <w:proofErr w:type="spellEnd"/>
+            <w:r>
+              <w:rPr>
+                <w:color w:val="000000"/>
+                <w:sz w:val="20"/>
+                <w:szCs w:val="20"/>
+              </w:rPr>
+              <w:t xml:space="preserve"> tests</w:t>
             </w:r>
           </w:p>
         </w:tc>
@@ -6067,12 +6341,6 @@
         <w:gridCol w:w="5960"/>
       </w:tblGrid>
       <w:tr>
-        <w:tblPrEx>
-          <w:tblCellMar>
-            <w:top w:w="0" w:type="dxa"/>
-            <w:bottom w:w="0" w:type="dxa"/>
-          </w:tblCellMar>
-        </w:tblPrEx>
         <w:trPr>
           <w:tblHeader/>
         </w:trPr>
@@ -6138,12 +6406,6 @@
         </w:tc>
       </w:tr>
       <w:tr>
-        <w:tblPrEx>
-          <w:tblCellMar>
-            <w:top w:w="0" w:type="dxa"/>
-            <w:bottom w:w="0" w:type="dxa"/>
-          </w:tblCellMar>
-        </w:tblPrEx>
         <w:tc>
           <w:tcPr>
             <w:tcW w:w="3400" w:type="dxa"/>
@@ -6200,12 +6462,6 @@
         </w:tc>
       </w:tr>
       <w:tr>
-        <w:tblPrEx>
-          <w:tblCellMar>
-            <w:top w:w="0" w:type="dxa"/>
-            <w:bottom w:w="0" w:type="dxa"/>
-          </w:tblCellMar>
-        </w:tblPrEx>
         <w:tc>
           <w:tcPr>
             <w:tcW w:w="3400" w:type="dxa"/>
@@ -6264,12 +6520,6 @@
         </w:tc>
       </w:tr>
       <w:tr>
-        <w:tblPrEx>
-          <w:tblCellMar>
-            <w:top w:w="0" w:type="dxa"/>
-            <w:bottom w:w="0" w:type="dxa"/>
-          </w:tblCellMar>
-        </w:tblPrEx>
         <w:tc>
           <w:tcPr>
             <w:tcW w:w="3400" w:type="dxa"/>
@@ -6326,12 +6576,6 @@
         </w:tc>
       </w:tr>
       <w:tr>
-        <w:tblPrEx>
-          <w:tblCellMar>
-            <w:top w:w="0" w:type="dxa"/>
-            <w:bottom w:w="0" w:type="dxa"/>
-          </w:tblCellMar>
-        </w:tblPrEx>
         <w:tc>
           <w:tcPr>
             <w:tcW w:w="3400" w:type="dxa"/>
@@ -6390,12 +6634,6 @@
         </w:tc>
       </w:tr>
       <w:tr>
-        <w:tblPrEx>
-          <w:tblCellMar>
-            <w:top w:w="0" w:type="dxa"/>
-            <w:bottom w:w="0" w:type="dxa"/>
-          </w:tblCellMar>
-        </w:tblPrEx>
         <w:tc>
           <w:tcPr>
             <w:tcW w:w="3400" w:type="dxa"/>
@@ -6452,12 +6690,6 @@
         </w:tc>
       </w:tr>
       <w:tr>
-        <w:tblPrEx>
-          <w:tblCellMar>
-            <w:top w:w="0" w:type="dxa"/>
-            <w:bottom w:w="0" w:type="dxa"/>
-          </w:tblCellMar>
-        </w:tblPrEx>
         <w:tc>
           <w:tcPr>
             <w:tcW w:w="3400" w:type="dxa"/>
@@ -6516,12 +6748,6 @@
         </w:tc>
       </w:tr>
       <w:tr>
-        <w:tblPrEx>
-          <w:tblCellMar>
-            <w:top w:w="0" w:type="dxa"/>
-            <w:bottom w:w="0" w:type="dxa"/>
-          </w:tblCellMar>
-        </w:tblPrEx>
         <w:tc>
           <w:tcPr>
             <w:tcW w:w="3400" w:type="dxa"/>
@@ -6578,12 +6804,6 @@
         </w:tc>
       </w:tr>
       <w:tr>
-        <w:tblPrEx>
-          <w:tblCellMar>
-            <w:top w:w="0" w:type="dxa"/>
-            <w:bottom w:w="0" w:type="dxa"/>
-          </w:tblCellMar>
-        </w:tblPrEx>
         <w:tc>
           <w:tcPr>
             <w:tcW w:w="3400" w:type="dxa"/>
@@ -6642,12 +6862,6 @@
         </w:tc>
       </w:tr>
       <w:tr>
-        <w:tblPrEx>
-          <w:tblCellMar>
-            <w:top w:w="0" w:type="dxa"/>
-            <w:bottom w:w="0" w:type="dxa"/>
-          </w:tblCellMar>
-        </w:tblPrEx>
         <w:tc>
           <w:tcPr>
             <w:tcW w:w="3400" w:type="dxa"/>
@@ -6705,12 +6919,6 @@
         </w:tc>
       </w:tr>
       <w:tr>
-        <w:tblPrEx>
-          <w:tblCellMar>
-            <w:top w:w="0" w:type="dxa"/>
-            <w:bottom w:w="0" w:type="dxa"/>
-          </w:tblCellMar>
-        </w:tblPrEx>
         <w:tc>
           <w:tcPr>
             <w:tcW w:w="3400" w:type="dxa"/>
@@ -6821,10 +7029,7 @@
         <w:spacing w:after="70"/>
       </w:pPr>
       <w:r>
-        <w:t>Fine-tune a multilingual model on labelled R</w:t>
-      </w:r>
-      <w:r>
-        <w:t>oman Urdu data.</w:t>
+        <w:t>Fine-tune a multilingual model on labelled Roman Urdu data.</w:t>
       </w:r>
     </w:p>
     <w:p>
@@ -6850,7 +7055,15 @@
         <w:spacing w:after="70"/>
       </w:pPr>
       <w:r>
-        <w:t>Include replies and analyse the like count as a measure of how much a comment is supported.</w:t>
+        <w:t xml:space="preserve">Include replies and </w:t>
+      </w:r>
+      <w:proofErr w:type="spellStart"/>
+      <w:r>
+        <w:t>analyse</w:t>
+      </w:r>
+      <w:proofErr w:type="spellEnd"/>
+      <w:r>
+        <w:t xml:space="preserve"> the like count as a measure of how much a comment is supported.</w:t>
       </w:r>
     </w:p>
     <w:p>
@@ -6869,13 +7082,15 @@
         <w:spacing w:after="120" w:line="300" w:lineRule="auto"/>
       </w:pPr>
       <w:r>
-        <w:t>The project collects more than 2,000 YouTube comments, separates collection from analysis, removes spam, supports English and Roman Urdu text, and produces a complete set of EDA outputs. The analysis shows that 71.5% of the 2,600 analysed comments are nega</w:t>
-      </w:r>
-      <w:r>
-        <w:t>tive toward the advertisement, 14.4% are positive and 14.1% are neutral. The local engine reaches an estimated 65% to 72% agreement with manual labels, and the optional Claude engine is provided for higher accuracy on sarcasm. The accuracy limits are repor</w:t>
-      </w:r>
-      <w:r>
-        <w:t>ted openly, together with the tools to measure them again on new data.</w:t>
+        <w:t xml:space="preserve">The project collects more than 2,000 YouTube comments, separates collection from analysis, removes spam, supports English and Roman Urdu text, and produces a complete set of EDA outputs. The analysis shows that 71.5% of the 2,600 </w:t>
+      </w:r>
+      <w:proofErr w:type="spellStart"/>
+      <w:r>
+        <w:t>analysed</w:t>
+      </w:r>
+      <w:proofErr w:type="spellEnd"/>
+      <w:r>
+        <w:t xml:space="preserve"> comments are negative toward the advertisement, 14.4% are positive and 14.1% are neutral. The local engine reaches an estimated 65% to 72% agreement with manual labels, and the optional Claude engine is provided for higher accuracy on sarcasm. The accuracy limits are reported openly, together with the tools to measure them again on new data.</w:t>
       </w:r>
     </w:p>
     <w:sectPr>
@@ -6914,13 +7129,41 @@
     <w:pPr>
       <w:jc w:val="center"/>
     </w:pPr>
+    <w:proofErr w:type="spellStart"/>
     <w:r>
       <w:rPr>
         <w:color w:val="7F7F7F"/>
         <w:sz w:val="18"/>
         <w:szCs w:val="18"/>
       </w:rPr>
-      <w:t xml:space="preserve">Uzair Khan  |  F2024376506  |  Page </w:t>
+      <w:t>Uzair</w:t>
+    </w:r>
+    <w:proofErr w:type="spellEnd"/>
+    <w:r>
+      <w:rPr>
+        <w:color w:val="7F7F7F"/>
+        <w:sz w:val="18"/>
+        <w:szCs w:val="18"/>
+      </w:rPr>
+      <w:t xml:space="preserve"> </w:t>
+    </w:r>
+    <w:proofErr w:type="gramStart"/>
+    <w:r>
+      <w:rPr>
+        <w:color w:val="7F7F7F"/>
+        <w:sz w:val="18"/>
+        <w:szCs w:val="18"/>
+      </w:rPr>
+      <w:t>Khan  |</w:t>
+    </w:r>
+    <w:proofErr w:type="gramEnd"/>
+    <w:r>
+      <w:rPr>
+        <w:color w:val="7F7F7F"/>
+        <w:sz w:val="18"/>
+        <w:szCs w:val="18"/>
+      </w:rPr>
+      <w:t xml:space="preserve">  F2024376506  |  Page </w:t>
     </w:r>
     <w:r>
       <w:rPr>
@@ -6953,7 +7196,7 @@
         <w:sz w:val="18"/>
         <w:szCs w:val="18"/>
       </w:rPr>
-      <w:t>2</w:t>
+      <w:t>11</w:t>
     </w:r>
     <w:r>
       <w:rPr>

</xml_diff>